<commit_message>
Update TuitionMe to Next.js rebuild and drop The Lecturer
TuitionMe now points at the full-stack Next.js App Router rebuild:
new live site (tuition-me-nextjs.vercel.app), single repo
(tuitionMe_Nextjs), and a stack description covering Next.js 16 /
React 19, Auth.js (NextAuth v5), MongoDB, Zod and Stripe Checkout
in place of the old CRA + Express + Firebase write-up.

The Lecturer is removed from the projects list.

Applied across all four surfaces: the site project data, the HTML
resume, the Word resume, and the PDF (regenerated from resume.html).

Co-Authored-By: Claude Opus 5 <noreply@anthropic.com>
</commit_message>
<xml_diff>
--- a/public/Gourab-Roy-Resume.docx
+++ b/public/Gourab-Roy-Resume.docx
@@ -347,103 +347,6 @@
           <w:color w:val="000000"/>
           <w:sz w:val="21"/>
         </w:rPr>
-        <w:t>The Lecturer</w:t>
-      </w:r>
-    </w:p>
-    <w:p>
-      <w:pPr>
-        <w:spacing w:before="0" w:after="20"/>
-      </w:pPr>
-      <w:r>
-        <w:rPr>
-          <w:rFonts w:ascii="Calibri" w:hAnsi="Calibri"/>
-          <w:b w:val="0"/>
-          <w:i w:val="0"/>
-          <w:color w:val="404040"/>
-          <w:sz w:val="18"/>
-        </w:rPr>
-        <w:t>Dual-panel blogging &amp; examination platform — admins publish content and quizzes, viewers read and take quizzes after login.</w:t>
-      </w:r>
-    </w:p>
-    <w:p>
-      <w:pPr>
-        <w:spacing w:before="0" w:after="20"/>
-      </w:pPr>
-      <w:r>
-        <w:rPr>
-          <w:rFonts w:ascii="Calibri" w:hAnsi="Calibri"/>
-          <w:b w:val="0"/>
-          <w:i w:val="0"/>
-          <w:color w:val="000000"/>
-          <w:sz w:val="18"/>
-        </w:rPr>
-        <w:t>Front-end: React.js, Tailwind, DaisyUI, React-Quill, Firebase Auth  ·  Back-end: Node.js, Express, MongoDB</w:t>
-      </w:r>
-    </w:p>
-    <w:p>
-      <w:pPr>
-        <w:spacing w:before="0" w:after="140"/>
-      </w:pPr>
-      <w:hyperlink r:id="rId16">
-        <w:r>
-          <w:rPr>
-            <w:color w:val="1F5F5B"/>
-            <w:u w:val="single"/>
-            <w:rFonts w:ascii="Calibri" w:hAnsi="Calibri"/>
-            <w:sz w:val="19"/>
-          </w:rPr>
-          <w:t>Live Site</w:t>
-        </w:r>
-      </w:hyperlink>
-      <w:r>
-        <w:rPr>
-          <w:color w:val="B0B0B0"/>
-          <w:sz w:val="18"/>
-        </w:rPr>
-        <w:t xml:space="preserve">   |   </w:t>
-      </w:r>
-      <w:hyperlink r:id="rId17">
-        <w:r>
-          <w:rPr>
-            <w:color w:val="1F5F5B"/>
-            <w:u w:val="single"/>
-            <w:rFonts w:ascii="Calibri" w:hAnsi="Calibri"/>
-            <w:sz w:val="19"/>
-          </w:rPr>
-          <w:t>Client Repo</w:t>
-        </w:r>
-      </w:hyperlink>
-      <w:r>
-        <w:rPr>
-          <w:color w:val="B0B0B0"/>
-          <w:sz w:val="18"/>
-        </w:rPr>
-        <w:t xml:space="preserve">   |   </w:t>
-      </w:r>
-      <w:hyperlink r:id="rId18">
-        <w:r>
-          <w:rPr>
-            <w:color w:val="1F5F5B"/>
-            <w:u w:val="single"/>
-            <w:rFonts w:ascii="Calibri" w:hAnsi="Calibri"/>
-            <w:sz w:val="19"/>
-          </w:rPr>
-          <w:t>Server Repo</w:t>
-        </w:r>
-      </w:hyperlink>
-    </w:p>
-    <w:p>
-      <w:pPr>
-        <w:spacing w:before="0" w:after="0"/>
-      </w:pPr>
-      <w:r>
-        <w:rPr>
-          <w:rFonts w:ascii="Calibri" w:hAnsi="Calibri"/>
-          <w:b/>
-          <w:i w:val="0"/>
-          <w:color w:val="000000"/>
-          <w:sz w:val="21"/>
-        </w:rPr>
         <w:t>Service Desk</w:t>
       </w:r>
     </w:p>
@@ -553,7 +456,7 @@
           <w:color w:val="000000"/>
           <w:sz w:val="18"/>
         </w:rPr>
-        <w:t>Front-end: React 18, React Router v6.4, Firebase Auth, Bootstrap 5  ·  Back-end: Node.js, Express, MongoDB, Stripe Checkout</w:t>
+        <w:t>Front-end: Next.js 16 (App Router), React 19, Bootstrap 5 / React-Bootstrap  ·  Back-end: Next.js Route Handlers &amp; Server Actions, Auth.js (NextAuth v5), MongoDB, Zod, Stripe Checkout</w:t>
       </w:r>
     </w:p>
     <w:p>
@@ -586,25 +489,7 @@
             <w:rFonts w:ascii="Calibri" w:hAnsi="Calibri"/>
             <w:sz w:val="19"/>
           </w:rPr>
-          <w:t>Client Repo</w:t>
-        </w:r>
-      </w:hyperlink>
-      <w:r>
-        <w:rPr>
-          <w:color w:val="B0B0B0"/>
-          <w:sz w:val="18"/>
-        </w:rPr>
-        <w:t xml:space="preserve">   |   </w:t>
-      </w:r>
-      <w:hyperlink r:id="rId23">
-        <w:r>
-          <w:rPr>
-            <w:color w:val="1F5F5B"/>
-            <w:u w:val="single"/>
-            <w:rFonts w:ascii="Calibri" w:hAnsi="Calibri"/>
-            <w:sz w:val="19"/>
-          </w:rPr>
-          <w:t>Server Repo</w:t>
+          <w:t>Repo</w:t>
         </w:r>
       </w:hyperlink>
     </w:p>

</xml_diff>